<commit_message>
Double AI-native payment attack coverage
</commit_message>
<xml_diff>
--- a/FraudGuard_360_Solution_Walkthrough.docx
+++ b/FraudGuard_360_Solution_Walkthrough.docx
@@ -302,7 +302,7 @@
                 <w:color w:val="17212B"/>
                 <w:sz w:val="19"/>
               </w:rPr>
-              <w:t>9,000 traceable synthetic training transactions plus one unseen attack-family holdout</w:t>
+              <w:t>210,000 traceable synthetic training transactions plus one unseen attack-family holdout</w:t>
             </w:r>
           </w:p>
         </w:tc>
@@ -354,7 +354,7 @@
                 <w:color w:val="17212B"/>
                 <w:sz w:val="19"/>
               </w:rPr>
-              <w:t>Regularized logistic regression + transparent rules (fg-linear-ad2919e91e)</w:t>
+              <w:t>Regularized logistic regression + transparent rules (fg-linear-45d1965319)</w:t>
             </w:r>
           </w:p>
         </w:tc>
@@ -1913,6 +1913,930 @@
           </w:p>
         </w:tc>
       </w:tr>
+      <w:tr>
+        <w:tc>
+          <w:tcPr>
+            <w:tcW w:type="dxa" w:w="1400"/>
+            <w:tcMar>
+              <w:top w:w="80" w:type="dxa"/>
+              <w:start w:w="120" w:type="dxa"/>
+              <w:bottom w:w="80" w:type="dxa"/>
+              <w:end w:w="120" w:type="dxa"/>
+            </w:tcMar>
+            <w:vAlign w:val="center"/>
+          </w:tcPr>
+          <w:p>
+            <w:pPr>
+              <w:spacing w:after="0" w:line="259" w:lineRule="auto"/>
+            </w:pPr>
+            <w:r>
+              <w:rPr>
+                <w:rFonts w:ascii="Calibri" w:hAnsi="Calibri"/>
+                <w:color w:val="17212B"/>
+                <w:sz w:val="18"/>
+              </w:rPr>
+              <w:t>SIMSWAP_001</w:t>
+            </w:r>
+          </w:p>
+        </w:tc>
+        <w:tc>
+          <w:tcPr>
+            <w:tcW w:type="dxa" w:w="3000"/>
+            <w:tcMar>
+              <w:top w:w="80" w:type="dxa"/>
+              <w:start w:w="120" w:type="dxa"/>
+              <w:bottom w:w="80" w:type="dxa"/>
+              <w:end w:w="120" w:type="dxa"/>
+            </w:tcMar>
+            <w:vAlign w:val="center"/>
+          </w:tcPr>
+          <w:p>
+            <w:pPr>
+              <w:spacing w:after="0" w:line="259" w:lineRule="auto"/>
+            </w:pPr>
+            <w:r>
+              <w:rPr>
+                <w:rFonts w:ascii="Calibri" w:hAnsi="Calibri"/>
+                <w:color w:val="17212B"/>
+                <w:sz w:val="18"/>
+              </w:rPr>
+              <w:t>Recovery-channel takeover</w:t>
+            </w:r>
+          </w:p>
+        </w:tc>
+        <w:tc>
+          <w:tcPr>
+            <w:tcW w:type="dxa" w:w="4960"/>
+            <w:tcMar>
+              <w:top w:w="80" w:type="dxa"/>
+              <w:start w:w="120" w:type="dxa"/>
+              <w:bottom w:w="80" w:type="dxa"/>
+              <w:end w:w="120" w:type="dxa"/>
+            </w:tcMar>
+            <w:vAlign w:val="center"/>
+          </w:tcPr>
+          <w:p>
+            <w:pPr>
+              <w:spacing w:after="0" w:line="259" w:lineRule="auto"/>
+            </w:pPr>
+            <w:r>
+              <w:rPr>
+                <w:rFonts w:ascii="Calibri" w:hAnsi="Calibri"/>
+                <w:color w:val="17212B"/>
+                <w:sz w:val="18"/>
+              </w:rPr>
+              <w:t>New device, identity mismatch, location shift</w:t>
+            </w:r>
+          </w:p>
+        </w:tc>
+      </w:tr>
+      <w:tr>
+        <w:tc>
+          <w:tcPr>
+            <w:tcW w:type="dxa" w:w="1400"/>
+            <w:tcMar>
+              <w:top w:w="80" w:type="dxa"/>
+              <w:start w:w="120" w:type="dxa"/>
+              <w:bottom w:w="80" w:type="dxa"/>
+              <w:end w:w="120" w:type="dxa"/>
+            </w:tcMar>
+            <w:vAlign w:val="center"/>
+          </w:tcPr>
+          <w:p>
+            <w:pPr>
+              <w:spacing w:after="0" w:line="259" w:lineRule="auto"/>
+            </w:pPr>
+            <w:r>
+              <w:rPr>
+                <w:rFonts w:ascii="Calibri" w:hAnsi="Calibri"/>
+                <w:color w:val="17212B"/>
+                <w:sz w:val="18"/>
+              </w:rPr>
+              <w:t>TOKEN_001</w:t>
+            </w:r>
+          </w:p>
+        </w:tc>
+        <w:tc>
+          <w:tcPr>
+            <w:tcW w:type="dxa" w:w="3000"/>
+            <w:tcMar>
+              <w:top w:w="80" w:type="dxa"/>
+              <w:start w:w="120" w:type="dxa"/>
+              <w:bottom w:w="80" w:type="dxa"/>
+              <w:end w:w="120" w:type="dxa"/>
+            </w:tcMar>
+            <w:vAlign w:val="center"/>
+          </w:tcPr>
+          <w:p>
+            <w:pPr>
+              <w:spacing w:after="0" w:line="259" w:lineRule="auto"/>
+            </w:pPr>
+            <w:r>
+              <w:rPr>
+                <w:rFonts w:ascii="Calibri" w:hAnsi="Calibri"/>
+                <w:color w:val="17212B"/>
+                <w:sz w:val="18"/>
+              </w:rPr>
+              <w:t>Token provisioning abuse</w:t>
+            </w:r>
+          </w:p>
+        </w:tc>
+        <w:tc>
+          <w:tcPr>
+            <w:tcW w:type="dxa" w:w="4960"/>
+            <w:tcMar>
+              <w:top w:w="80" w:type="dxa"/>
+              <w:start w:w="120" w:type="dxa"/>
+              <w:bottom w:w="80" w:type="dxa"/>
+              <w:end w:w="120" w:type="dxa"/>
+            </w:tcMar>
+            <w:vAlign w:val="center"/>
+          </w:tcPr>
+          <w:p>
+            <w:pPr>
+              <w:spacing w:after="0" w:line="259" w:lineRule="auto"/>
+            </w:pPr>
+            <w:r>
+              <w:rPr>
+                <w:rFonts w:ascii="Calibri" w:hAnsi="Calibri"/>
+                <w:color w:val="17212B"/>
+                <w:sz w:val="18"/>
+              </w:rPr>
+              <w:t>Device novelty, shared infrastructure, remote use</w:t>
+            </w:r>
+          </w:p>
+        </w:tc>
+      </w:tr>
+      <w:tr>
+        <w:tc>
+          <w:tcPr>
+            <w:tcW w:type="dxa" w:w="1400"/>
+            <w:tcMar>
+              <w:top w:w="80" w:type="dxa"/>
+              <w:start w:w="120" w:type="dxa"/>
+              <w:bottom w:w="80" w:type="dxa"/>
+              <w:end w:w="120" w:type="dxa"/>
+            </w:tcMar>
+            <w:vAlign w:val="center"/>
+          </w:tcPr>
+          <w:p>
+            <w:pPr>
+              <w:spacing w:after="0" w:line="259" w:lineRule="auto"/>
+            </w:pPr>
+            <w:r>
+              <w:rPr>
+                <w:rFonts w:ascii="Calibri" w:hAnsi="Calibri"/>
+                <w:color w:val="17212B"/>
+                <w:sz w:val="18"/>
+              </w:rPr>
+              <w:t>QR_001</w:t>
+            </w:r>
+          </w:p>
+        </w:tc>
+        <w:tc>
+          <w:tcPr>
+            <w:tcW w:type="dxa" w:w="3000"/>
+            <w:tcMar>
+              <w:top w:w="80" w:type="dxa"/>
+              <w:start w:w="120" w:type="dxa"/>
+              <w:bottom w:w="80" w:type="dxa"/>
+              <w:end w:w="120" w:type="dxa"/>
+            </w:tcMar>
+            <w:vAlign w:val="center"/>
+          </w:tcPr>
+          <w:p>
+            <w:pPr>
+              <w:spacing w:after="0" w:line="259" w:lineRule="auto"/>
+            </w:pPr>
+            <w:r>
+              <w:rPr>
+                <w:rFonts w:ascii="Calibri" w:hAnsi="Calibri"/>
+                <w:color w:val="17212B"/>
+                <w:sz w:val="18"/>
+              </w:rPr>
+              <w:t>QR destination substitution</w:t>
+            </w:r>
+          </w:p>
+        </w:tc>
+        <w:tc>
+          <w:tcPr>
+            <w:tcW w:type="dxa" w:w="4960"/>
+            <w:tcMar>
+              <w:top w:w="80" w:type="dxa"/>
+              <w:start w:w="120" w:type="dxa"/>
+              <w:bottom w:w="80" w:type="dxa"/>
+              <w:end w:w="120" w:type="dxa"/>
+            </w:tcMar>
+            <w:vAlign w:val="center"/>
+          </w:tcPr>
+          <w:p>
+            <w:pPr>
+              <w:spacing w:after="0" w:line="259" w:lineRule="auto"/>
+            </w:pPr>
+            <w:r>
+              <w:rPr>
+                <w:rFonts w:ascii="Calibri" w:hAnsi="Calibri"/>
+                <w:color w:val="17212B"/>
+                <w:sz w:val="18"/>
+              </w:rPr>
+              <w:t>New payee, merchant mismatch, geography</w:t>
+            </w:r>
+          </w:p>
+        </w:tc>
+      </w:tr>
+      <w:tr>
+        <w:tc>
+          <w:tcPr>
+            <w:tcW w:type="dxa" w:w="1400"/>
+            <w:tcMar>
+              <w:top w:w="80" w:type="dxa"/>
+              <w:start w:w="120" w:type="dxa"/>
+              <w:bottom w:w="80" w:type="dxa"/>
+              <w:end w:w="120" w:type="dxa"/>
+            </w:tcMar>
+            <w:vAlign w:val="center"/>
+          </w:tcPr>
+          <w:p>
+            <w:pPr>
+              <w:spacing w:after="0" w:line="259" w:lineRule="auto"/>
+            </w:pPr>
+            <w:r>
+              <w:rPr>
+                <w:rFonts w:ascii="Calibri" w:hAnsi="Calibri"/>
+                <w:color w:val="17212B"/>
+                <w:sz w:val="18"/>
+              </w:rPr>
+              <w:t>BNPL_001</w:t>
+            </w:r>
+          </w:p>
+        </w:tc>
+        <w:tc>
+          <w:tcPr>
+            <w:tcW w:type="dxa" w:w="3000"/>
+            <w:tcMar>
+              <w:top w:w="80" w:type="dxa"/>
+              <w:start w:w="120" w:type="dxa"/>
+              <w:bottom w:w="80" w:type="dxa"/>
+              <w:end w:w="120" w:type="dxa"/>
+            </w:tcMar>
+            <w:vAlign w:val="center"/>
+          </w:tcPr>
+          <w:p>
+            <w:pPr>
+              <w:spacing w:after="0" w:line="259" w:lineRule="auto"/>
+            </w:pPr>
+            <w:r>
+              <w:rPr>
+                <w:rFonts w:ascii="Calibri" w:hAnsi="Calibri"/>
+                <w:color w:val="17212B"/>
+                <w:sz w:val="18"/>
+              </w:rPr>
+              <w:t>Cross-provider credit bust-out</w:t>
+            </w:r>
+          </w:p>
+        </w:tc>
+        <w:tc>
+          <w:tcPr>
+            <w:tcW w:type="dxa" w:w="4960"/>
+            <w:tcMar>
+              <w:top w:w="80" w:type="dxa"/>
+              <w:start w:w="120" w:type="dxa"/>
+              <w:bottom w:w="80" w:type="dxa"/>
+              <w:end w:w="120" w:type="dxa"/>
+            </w:tcMar>
+            <w:vAlign w:val="center"/>
+          </w:tcPr>
+          <w:p>
+            <w:pPr>
+              <w:spacing w:after="0" w:line="259" w:lineRule="auto"/>
+            </w:pPr>
+            <w:r>
+              <w:rPr>
+                <w:rFonts w:ascii="Calibri" w:hAnsi="Calibri"/>
+                <w:color w:val="17212B"/>
+                <w:sz w:val="18"/>
+              </w:rPr>
+              <w:t>New account, velocity, high-value deviation</w:t>
+            </w:r>
+          </w:p>
+        </w:tc>
+      </w:tr>
+      <w:tr>
+        <w:tc>
+          <w:tcPr>
+            <w:tcW w:type="dxa" w:w="1400"/>
+            <w:tcMar>
+              <w:top w:w="80" w:type="dxa"/>
+              <w:start w:w="120" w:type="dxa"/>
+              <w:bottom w:w="80" w:type="dxa"/>
+              <w:end w:w="120" w:type="dxa"/>
+            </w:tcMar>
+            <w:vAlign w:val="center"/>
+          </w:tcPr>
+          <w:p>
+            <w:pPr>
+              <w:spacing w:after="0" w:line="259" w:lineRule="auto"/>
+            </w:pPr>
+            <w:r>
+              <w:rPr>
+                <w:rFonts w:ascii="Calibri" w:hAnsi="Calibri"/>
+                <w:color w:val="17212B"/>
+                <w:sz w:val="18"/>
+              </w:rPr>
+              <w:t>INVOICE_001</w:t>
+            </w:r>
+          </w:p>
+        </w:tc>
+        <w:tc>
+          <w:tcPr>
+            <w:tcW w:type="dxa" w:w="3000"/>
+            <w:tcMar>
+              <w:top w:w="80" w:type="dxa"/>
+              <w:start w:w="120" w:type="dxa"/>
+              <w:bottom w:w="80" w:type="dxa"/>
+              <w:end w:w="120" w:type="dxa"/>
+            </w:tcMar>
+            <w:vAlign w:val="center"/>
+          </w:tcPr>
+          <w:p>
+            <w:pPr>
+              <w:spacing w:after="0" w:line="259" w:lineRule="auto"/>
+            </w:pPr>
+            <w:r>
+              <w:rPr>
+                <w:rFonts w:ascii="Calibri" w:hAnsi="Calibri"/>
+                <w:color w:val="17212B"/>
+                <w:sz w:val="18"/>
+              </w:rPr>
+              <w:t>Business payment redirection</w:t>
+            </w:r>
+          </w:p>
+        </w:tc>
+        <w:tc>
+          <w:tcPr>
+            <w:tcW w:type="dxa" w:w="4960"/>
+            <w:tcMar>
+              <w:top w:w="80" w:type="dxa"/>
+              <w:start w:w="120" w:type="dxa"/>
+              <w:bottom w:w="80" w:type="dxa"/>
+              <w:end w:w="120" w:type="dxa"/>
+            </w:tcMar>
+            <w:vAlign w:val="center"/>
+          </w:tcPr>
+          <w:p>
+            <w:pPr>
+              <w:spacing w:after="0" w:line="259" w:lineRule="auto"/>
+            </w:pPr>
+            <w:r>
+              <w:rPr>
+                <w:rFonts w:ascii="Calibri" w:hAnsi="Calibri"/>
+                <w:color w:val="17212B"/>
+                <w:sz w:val="18"/>
+              </w:rPr>
+              <w:t>New beneficiary, amount shift, merchant context</w:t>
+            </w:r>
+          </w:p>
+        </w:tc>
+      </w:tr>
+      <w:tr>
+        <w:tc>
+          <w:tcPr>
+            <w:tcW w:type="dxa" w:w="1400"/>
+            <w:tcMar>
+              <w:top w:w="80" w:type="dxa"/>
+              <w:start w:w="120" w:type="dxa"/>
+              <w:bottom w:w="80" w:type="dxa"/>
+              <w:end w:w="120" w:type="dxa"/>
+            </w:tcMar>
+            <w:vAlign w:val="center"/>
+          </w:tcPr>
+          <w:p>
+            <w:pPr>
+              <w:spacing w:after="0" w:line="259" w:lineRule="auto"/>
+            </w:pPr>
+            <w:r>
+              <w:rPr>
+                <w:rFonts w:ascii="Calibri" w:hAnsi="Calibri"/>
+                <w:color w:val="17212B"/>
+                <w:sz w:val="18"/>
+              </w:rPr>
+              <w:t>LOYALTY_001</w:t>
+            </w:r>
+          </w:p>
+        </w:tc>
+        <w:tc>
+          <w:tcPr>
+            <w:tcW w:type="dxa" w:w="3000"/>
+            <w:tcMar>
+              <w:top w:w="80" w:type="dxa"/>
+              <w:start w:w="120" w:type="dxa"/>
+              <w:bottom w:w="80" w:type="dxa"/>
+              <w:end w:w="120" w:type="dxa"/>
+            </w:tcMar>
+            <w:vAlign w:val="center"/>
+          </w:tcPr>
+          <w:p>
+            <w:pPr>
+              <w:spacing w:after="0" w:line="259" w:lineRule="auto"/>
+            </w:pPr>
+            <w:r>
+              <w:rPr>
+                <w:rFonts w:ascii="Calibri" w:hAnsi="Calibri"/>
+                <w:color w:val="17212B"/>
+                <w:sz w:val="18"/>
+              </w:rPr>
+              <w:t>Loyalty value theft</w:t>
+            </w:r>
+          </w:p>
+        </w:tc>
+        <w:tc>
+          <w:tcPr>
+            <w:tcW w:type="dxa" w:w="4960"/>
+            <w:tcMar>
+              <w:top w:w="80" w:type="dxa"/>
+              <w:start w:w="120" w:type="dxa"/>
+              <w:bottom w:w="80" w:type="dxa"/>
+              <w:end w:w="120" w:type="dxa"/>
+            </w:tcMar>
+            <w:vAlign w:val="center"/>
+          </w:tcPr>
+          <w:p>
+            <w:pPr>
+              <w:spacing w:after="0" w:line="259" w:lineRule="auto"/>
+            </w:pPr>
+            <w:r>
+              <w:rPr>
+                <w:rFonts w:ascii="Calibri" w:hAnsi="Calibri"/>
+                <w:color w:val="17212B"/>
+                <w:sz w:val="18"/>
+              </w:rPr>
+              <w:t>New device, redemption velocity, small-value bursts</w:t>
+            </w:r>
+          </w:p>
+        </w:tc>
+      </w:tr>
+      <w:tr>
+        <w:tc>
+          <w:tcPr>
+            <w:tcW w:type="dxa" w:w="1400"/>
+            <w:tcMar>
+              <w:top w:w="80" w:type="dxa"/>
+              <w:start w:w="120" w:type="dxa"/>
+              <w:bottom w:w="80" w:type="dxa"/>
+              <w:end w:w="120" w:type="dxa"/>
+            </w:tcMar>
+            <w:vAlign w:val="center"/>
+          </w:tcPr>
+          <w:p>
+            <w:pPr>
+              <w:spacing w:after="0" w:line="259" w:lineRule="auto"/>
+            </w:pPr>
+            <w:r>
+              <w:rPr>
+                <w:rFonts w:ascii="Calibri" w:hAnsi="Calibri"/>
+                <w:color w:val="17212B"/>
+                <w:sz w:val="18"/>
+              </w:rPr>
+              <w:t>SUBSCRIPTION_001</w:t>
+            </w:r>
+          </w:p>
+        </w:tc>
+        <w:tc>
+          <w:tcPr>
+            <w:tcW w:type="dxa" w:w="3000"/>
+            <w:tcMar>
+              <w:top w:w="80" w:type="dxa"/>
+              <w:start w:w="120" w:type="dxa"/>
+              <w:bottom w:w="80" w:type="dxa"/>
+              <w:end w:w="120" w:type="dxa"/>
+            </w:tcMar>
+            <w:vAlign w:val="center"/>
+          </w:tcPr>
+          <w:p>
+            <w:pPr>
+              <w:spacing w:after="0" w:line="259" w:lineRule="auto"/>
+            </w:pPr>
+            <w:r>
+              <w:rPr>
+                <w:rFonts w:ascii="Calibri" w:hAnsi="Calibri"/>
+                <w:color w:val="17212B"/>
+                <w:sz w:val="18"/>
+              </w:rPr>
+              <w:t>Synthetic subscription farm</w:t>
+            </w:r>
+          </w:p>
+        </w:tc>
+        <w:tc>
+          <w:tcPr>
+            <w:tcW w:type="dxa" w:w="4960"/>
+            <w:tcMar>
+              <w:top w:w="80" w:type="dxa"/>
+              <w:start w:w="120" w:type="dxa"/>
+              <w:bottom w:w="80" w:type="dxa"/>
+              <w:end w:w="120" w:type="dxa"/>
+            </w:tcMar>
+            <w:vAlign w:val="center"/>
+          </w:tcPr>
+          <w:p>
+            <w:pPr>
+              <w:spacing w:after="0" w:line="259" w:lineRule="auto"/>
+            </w:pPr>
+            <w:r>
+              <w:rPr>
+                <w:rFonts w:ascii="Calibri" w:hAnsi="Calibri"/>
+                <w:color w:val="17212B"/>
+                <w:sz w:val="18"/>
+              </w:rPr>
+              <w:t>Shared device, remote payment, new accounts</w:t>
+            </w:r>
+          </w:p>
+        </w:tc>
+      </w:tr>
+      <w:tr>
+        <w:tc>
+          <w:tcPr>
+            <w:tcW w:type="dxa" w:w="1400"/>
+            <w:tcMar>
+              <w:top w:w="80" w:type="dxa"/>
+              <w:start w:w="120" w:type="dxa"/>
+              <w:bottom w:w="80" w:type="dxa"/>
+              <w:end w:w="120" w:type="dxa"/>
+            </w:tcMar>
+            <w:vAlign w:val="center"/>
+          </w:tcPr>
+          <w:p>
+            <w:pPr>
+              <w:spacing w:after="0" w:line="259" w:lineRule="auto"/>
+            </w:pPr>
+            <w:r>
+              <w:rPr>
+                <w:rFonts w:ascii="Calibri" w:hAnsi="Calibri"/>
+                <w:color w:val="17212B"/>
+                <w:sz w:val="18"/>
+              </w:rPr>
+              <w:t>MERCHANT_001</w:t>
+            </w:r>
+          </w:p>
+        </w:tc>
+        <w:tc>
+          <w:tcPr>
+            <w:tcW w:type="dxa" w:w="3000"/>
+            <w:tcMar>
+              <w:top w:w="80" w:type="dxa"/>
+              <w:start w:w="120" w:type="dxa"/>
+              <w:bottom w:w="80" w:type="dxa"/>
+              <w:end w:w="120" w:type="dxa"/>
+            </w:tcMar>
+            <w:vAlign w:val="center"/>
+          </w:tcPr>
+          <w:p>
+            <w:pPr>
+              <w:spacing w:after="0" w:line="259" w:lineRule="auto"/>
+            </w:pPr>
+            <w:r>
+              <w:rPr>
+                <w:rFonts w:ascii="Calibri" w:hAnsi="Calibri"/>
+                <w:color w:val="17212B"/>
+                <w:sz w:val="18"/>
+              </w:rPr>
+              <w:t>Transaction laundering</w:t>
+            </w:r>
+          </w:p>
+        </w:tc>
+        <w:tc>
+          <w:tcPr>
+            <w:tcW w:type="dxa" w:w="4960"/>
+            <w:tcMar>
+              <w:top w:w="80" w:type="dxa"/>
+              <w:start w:w="120" w:type="dxa"/>
+              <w:bottom w:w="80" w:type="dxa"/>
+              <w:end w:w="120" w:type="dxa"/>
+            </w:tcMar>
+            <w:vAlign w:val="center"/>
+          </w:tcPr>
+          <w:p>
+            <w:pPr>
+              <w:spacing w:after="0" w:line="259" w:lineRule="auto"/>
+            </w:pPr>
+            <w:r>
+              <w:rPr>
+                <w:rFonts w:ascii="Calibri" w:hAnsi="Calibri"/>
+                <w:color w:val="17212B"/>
+                <w:sz w:val="18"/>
+              </w:rPr>
+              <w:t>Merchant risk, graph density, amount distribution</w:t>
+            </w:r>
+          </w:p>
+        </w:tc>
+      </w:tr>
+      <w:tr>
+        <w:tc>
+          <w:tcPr>
+            <w:tcW w:type="dxa" w:w="1400"/>
+            <w:tcMar>
+              <w:top w:w="80" w:type="dxa"/>
+              <w:start w:w="120" w:type="dxa"/>
+              <w:bottom w:w="80" w:type="dxa"/>
+              <w:end w:w="120" w:type="dxa"/>
+            </w:tcMar>
+            <w:vAlign w:val="center"/>
+          </w:tcPr>
+          <w:p>
+            <w:pPr>
+              <w:spacing w:after="0" w:line="259" w:lineRule="auto"/>
+            </w:pPr>
+            <w:r>
+              <w:rPr>
+                <w:rFonts w:ascii="Calibri" w:hAnsi="Calibri"/>
+                <w:color w:val="17212B"/>
+                <w:sz w:val="18"/>
+              </w:rPr>
+              <w:t>NFC_001</w:t>
+            </w:r>
+          </w:p>
+        </w:tc>
+        <w:tc>
+          <w:tcPr>
+            <w:tcW w:type="dxa" w:w="3000"/>
+            <w:tcMar>
+              <w:top w:w="80" w:type="dxa"/>
+              <w:start w:w="120" w:type="dxa"/>
+              <w:bottom w:w="80" w:type="dxa"/>
+              <w:end w:w="120" w:type="dxa"/>
+            </w:tcMar>
+            <w:vAlign w:val="center"/>
+          </w:tcPr>
+          <w:p>
+            <w:pPr>
+              <w:spacing w:after="0" w:line="259" w:lineRule="auto"/>
+            </w:pPr>
+            <w:r>
+              <w:rPr>
+                <w:rFonts w:ascii="Calibri" w:hAnsi="Calibri"/>
+                <w:color w:val="17212B"/>
+                <w:sz w:val="18"/>
+              </w:rPr>
+              <w:t>Contactless proximity relay</w:t>
+            </w:r>
+          </w:p>
+        </w:tc>
+        <w:tc>
+          <w:tcPr>
+            <w:tcW w:type="dxa" w:w="4960"/>
+            <w:tcMar>
+              <w:top w:w="80" w:type="dxa"/>
+              <w:start w:w="120" w:type="dxa"/>
+              <w:bottom w:w="80" w:type="dxa"/>
+              <w:end w:w="120" w:type="dxa"/>
+            </w:tcMar>
+            <w:vAlign w:val="center"/>
+          </w:tcPr>
+          <w:p>
+            <w:pPr>
+              <w:spacing w:after="0" w:line="259" w:lineRule="auto"/>
+            </w:pPr>
+            <w:r>
+              <w:rPr>
+                <w:rFonts w:ascii="Calibri" w:hAnsi="Calibri"/>
+                <w:color w:val="17212B"/>
+                <w:sz w:val="18"/>
+              </w:rPr>
+              <w:t>Location contradiction, stable device, amount shift</w:t>
+            </w:r>
+          </w:p>
+        </w:tc>
+      </w:tr>
+      <w:tr>
+        <w:tc>
+          <w:tcPr>
+            <w:tcW w:type="dxa" w:w="1400"/>
+            <w:tcMar>
+              <w:top w:w="80" w:type="dxa"/>
+              <w:start w:w="120" w:type="dxa"/>
+              <w:bottom w:w="80" w:type="dxa"/>
+              <w:end w:w="120" w:type="dxa"/>
+            </w:tcMar>
+            <w:vAlign w:val="center"/>
+          </w:tcPr>
+          <w:p>
+            <w:pPr>
+              <w:spacing w:after="0" w:line="259" w:lineRule="auto"/>
+            </w:pPr>
+            <w:r>
+              <w:rPr>
+                <w:rFonts w:ascii="Calibri" w:hAnsi="Calibri"/>
+                <w:color w:val="17212B"/>
+                <w:sz w:val="18"/>
+              </w:rPr>
+              <w:t>REMIT_001</w:t>
+            </w:r>
+          </w:p>
+        </w:tc>
+        <w:tc>
+          <w:tcPr>
+            <w:tcW w:type="dxa" w:w="3000"/>
+            <w:tcMar>
+              <w:top w:w="80" w:type="dxa"/>
+              <w:start w:w="120" w:type="dxa"/>
+              <w:bottom w:w="80" w:type="dxa"/>
+              <w:end w:w="120" w:type="dxa"/>
+            </w:tcMar>
+            <w:vAlign w:val="center"/>
+          </w:tcPr>
+          <w:p>
+            <w:pPr>
+              <w:spacing w:after="0" w:line="259" w:lineRule="auto"/>
+            </w:pPr>
+            <w:r>
+              <w:rPr>
+                <w:rFonts w:ascii="Calibri" w:hAnsi="Calibri"/>
+                <w:color w:val="17212B"/>
+                <w:sz w:val="18"/>
+              </w:rPr>
+              <w:t>Remittance corridor abuse</w:t>
+            </w:r>
+          </w:p>
+        </w:tc>
+        <w:tc>
+          <w:tcPr>
+            <w:tcW w:type="dxa" w:w="4960"/>
+            <w:tcMar>
+              <w:top w:w="80" w:type="dxa"/>
+              <w:start w:w="120" w:type="dxa"/>
+              <w:bottom w:w="80" w:type="dxa"/>
+              <w:end w:w="120" w:type="dxa"/>
+            </w:tcMar>
+            <w:vAlign w:val="center"/>
+          </w:tcPr>
+          <w:p>
+            <w:pPr>
+              <w:spacing w:after="0" w:line="259" w:lineRule="auto"/>
+            </w:pPr>
+            <w:r>
+              <w:rPr>
+                <w:rFonts w:ascii="Calibri" w:hAnsi="Calibri"/>
+                <w:color w:val="17212B"/>
+                <w:sz w:val="18"/>
+              </w:rPr>
+              <w:t>Cross-border paths, new payees, graph density</w:t>
+            </w:r>
+          </w:p>
+        </w:tc>
+      </w:tr>
+      <w:tr>
+        <w:tc>
+          <w:tcPr>
+            <w:tcW w:type="dxa" w:w="1400"/>
+            <w:tcMar>
+              <w:top w:w="80" w:type="dxa"/>
+              <w:start w:w="120" w:type="dxa"/>
+              <w:bottom w:w="80" w:type="dxa"/>
+              <w:end w:w="120" w:type="dxa"/>
+            </w:tcMar>
+            <w:vAlign w:val="center"/>
+          </w:tcPr>
+          <w:p>
+            <w:pPr>
+              <w:spacing w:after="0" w:line="259" w:lineRule="auto"/>
+            </w:pPr>
+            <w:r>
+              <w:rPr>
+                <w:rFonts w:ascii="Calibri" w:hAnsi="Calibri"/>
+                <w:color w:val="17212B"/>
+                <w:sz w:val="18"/>
+              </w:rPr>
+              <w:t>PAYROLL_001</w:t>
+            </w:r>
+          </w:p>
+        </w:tc>
+        <w:tc>
+          <w:tcPr>
+            <w:tcW w:type="dxa" w:w="3000"/>
+            <w:tcMar>
+              <w:top w:w="80" w:type="dxa"/>
+              <w:start w:w="120" w:type="dxa"/>
+              <w:bottom w:w="80" w:type="dxa"/>
+              <w:end w:w="120" w:type="dxa"/>
+            </w:tcMar>
+            <w:vAlign w:val="center"/>
+          </w:tcPr>
+          <w:p>
+            <w:pPr>
+              <w:spacing w:after="0" w:line="259" w:lineRule="auto"/>
+            </w:pPr>
+            <w:r>
+              <w:rPr>
+                <w:rFonts w:ascii="Calibri" w:hAnsi="Calibri"/>
+                <w:color w:val="17212B"/>
+                <w:sz w:val="18"/>
+              </w:rPr>
+              <w:t>Payroll redirection</w:t>
+            </w:r>
+          </w:p>
+        </w:tc>
+        <w:tc>
+          <w:tcPr>
+            <w:tcW w:type="dxa" w:w="4960"/>
+            <w:tcMar>
+              <w:top w:w="80" w:type="dxa"/>
+              <w:start w:w="120" w:type="dxa"/>
+              <w:bottom w:w="80" w:type="dxa"/>
+              <w:end w:w="120" w:type="dxa"/>
+            </w:tcMar>
+            <w:vAlign w:val="center"/>
+          </w:tcPr>
+          <w:p>
+            <w:pPr>
+              <w:spacing w:after="0" w:line="259" w:lineRule="auto"/>
+            </w:pPr>
+            <w:r>
+              <w:rPr>
+                <w:rFonts w:ascii="Calibri" w:hAnsi="Calibri"/>
+                <w:color w:val="17212B"/>
+                <w:sz w:val="18"/>
+              </w:rPr>
+              <w:t>New destination, amount shift, identity mismatch</w:t>
+            </w:r>
+          </w:p>
+        </w:tc>
+      </w:tr>
+      <w:tr>
+        <w:tc>
+          <w:tcPr>
+            <w:tcW w:type="dxa" w:w="1400"/>
+            <w:tcMar>
+              <w:top w:w="80" w:type="dxa"/>
+              <w:start w:w="120" w:type="dxa"/>
+              <w:bottom w:w="80" w:type="dxa"/>
+              <w:end w:w="120" w:type="dxa"/>
+            </w:tcMar>
+            <w:vAlign w:val="center"/>
+          </w:tcPr>
+          <w:p>
+            <w:pPr>
+              <w:spacing w:after="0" w:line="259" w:lineRule="auto"/>
+            </w:pPr>
+            <w:r>
+              <w:rPr>
+                <w:rFonts w:ascii="Calibri" w:hAnsi="Calibri"/>
+                <w:color w:val="17212B"/>
+                <w:sz w:val="18"/>
+              </w:rPr>
+              <w:t>GIFT_001</w:t>
+            </w:r>
+          </w:p>
+        </w:tc>
+        <w:tc>
+          <w:tcPr>
+            <w:tcW w:type="dxa" w:w="3000"/>
+            <w:tcMar>
+              <w:top w:w="80" w:type="dxa"/>
+              <w:start w:w="120" w:type="dxa"/>
+              <w:bottom w:w="80" w:type="dxa"/>
+              <w:end w:w="120" w:type="dxa"/>
+            </w:tcMar>
+            <w:vAlign w:val="center"/>
+          </w:tcPr>
+          <w:p>
+            <w:pPr>
+              <w:spacing w:after="0" w:line="259" w:lineRule="auto"/>
+            </w:pPr>
+            <w:r>
+              <w:rPr>
+                <w:rFonts w:ascii="Calibri" w:hAnsi="Calibri"/>
+                <w:color w:val="17212B"/>
+                <w:sz w:val="18"/>
+              </w:rPr>
+              <w:t>Gift-card conversion cascade</w:t>
+            </w:r>
+          </w:p>
+        </w:tc>
+        <w:tc>
+          <w:tcPr>
+            <w:tcW w:type="dxa" w:w="4960"/>
+            <w:tcMar>
+              <w:top w:w="80" w:type="dxa"/>
+              <w:start w:w="120" w:type="dxa"/>
+              <w:bottom w:w="80" w:type="dxa"/>
+              <w:end w:w="120" w:type="dxa"/>
+            </w:tcMar>
+            <w:vAlign w:val="center"/>
+          </w:tcPr>
+          <w:p>
+            <w:pPr>
+              <w:spacing w:after="0" w:line="259" w:lineRule="auto"/>
+            </w:pPr>
+            <w:r>
+              <w:rPr>
+                <w:rFonts w:ascii="Calibri" w:hAnsi="Calibri"/>
+                <w:color w:val="17212B"/>
+                <w:sz w:val="18"/>
+              </w:rPr>
+              <w:t>Small-value bursts, velocity, merchant risk</w:t>
+            </w:r>
+          </w:p>
+        </w:tc>
+      </w:tr>
     </w:tbl>
     <w:p>
       <w:pPr>
@@ -2242,7 +3166,7 @@
                 <w:color w:val="17212B"/>
                 <w:sz w:val="19"/>
               </w:rPr>
-              <w:t>9,000 training/validation/test feature rows</w:t>
+              <w:t>210,000 training/validation/test feature rows</w:t>
             </w:r>
           </w:p>
         </w:tc>
@@ -2294,7 +3218,7 @@
                 <w:color w:val="17212B"/>
                 <w:sz w:val="19"/>
               </w:rPr>
-              <w:t>Nine training attack families; LAUNDER_001 excluded as holdout</w:t>
+              <w:t>21 training attack families; LAUNDER_001 excluded as holdout</w:t>
             </w:r>
           </w:p>
         </w:tc>
@@ -4232,7 +5156,7 @@
                 <w:color w:val="17212B"/>
                 <w:sz w:val="19"/>
               </w:rPr>
-              <w:t>fg-linear-ad2919e91e</w:t>
+              <w:t>fg-linear-45d1965319</w:t>
             </w:r>
           </w:p>
         </w:tc>
@@ -4388,7 +5312,7 @@
                 <w:color w:val="17212B"/>
                 <w:sz w:val="19"/>
               </w:rPr>
-              <w:t>0.57</w:t>
+              <w:t>0.63</w:t>
             </w:r>
           </w:p>
         </w:tc>
@@ -4440,7 +5364,7 @@
                 <w:color w:val="17212B"/>
                 <w:sz w:val="19"/>
               </w:rPr>
-              <w:t>6235</w:t>
+              <w:t>146997</w:t>
             </w:r>
           </w:p>
         </w:tc>
@@ -4492,7 +5416,7 @@
                 <w:color w:val="17212B"/>
                 <w:sz w:val="19"/>
               </w:rPr>
-              <w:t>1049</w:t>
+              <w:t>20865</w:t>
             </w:r>
           </w:p>
         </w:tc>
@@ -4544,7 +5468,7 @@
                 <w:color w:val="17212B"/>
                 <w:sz w:val="19"/>
               </w:rPr>
-              <w:t>1716</w:t>
+              <w:t>42138</w:t>
             </w:r>
           </w:p>
         </w:tc>
@@ -4814,7 +5738,7 @@
                 <w:color w:val="17212B"/>
                 <w:sz w:val="18"/>
               </w:rPr>
-              <w:t>0.749</w:t>
+              <w:t>0.772</w:t>
             </w:r>
           </w:p>
         </w:tc>
@@ -4839,7 +5763,7 @@
                 <w:color w:val="17212B"/>
                 <w:sz w:val="18"/>
               </w:rPr>
-              <w:t>0.756</w:t>
+              <w:t>0.773</w:t>
             </w:r>
           </w:p>
         </w:tc>
@@ -4864,7 +5788,7 @@
                 <w:color w:val="17212B"/>
                 <w:sz w:val="18"/>
               </w:rPr>
-              <w:t>0.752</w:t>
+              <w:t>0.773</w:t>
             </w:r>
           </w:p>
         </w:tc>
@@ -4889,7 +5813,7 @@
                 <w:color w:val="17212B"/>
                 <w:sz w:val="18"/>
               </w:rPr>
-              <w:t>0.084</w:t>
+              <w:t>0.076</w:t>
             </w:r>
           </w:p>
         </w:tc>
@@ -4941,7 +5865,7 @@
                 <w:color w:val="17212B"/>
                 <w:sz w:val="18"/>
               </w:rPr>
-              <w:t>0.673</w:t>
+              <w:t>0.688</w:t>
             </w:r>
           </w:p>
         </w:tc>
@@ -4966,7 +5890,7 @@
                 <w:color w:val="17212B"/>
                 <w:sz w:val="18"/>
               </w:rPr>
-              <w:t>0.877</w:t>
+              <w:t>0.869</w:t>
             </w:r>
           </w:p>
         </w:tc>
@@ -4991,7 +5915,7 @@
                 <w:color w:val="17212B"/>
                 <w:sz w:val="18"/>
               </w:rPr>
-              <w:t>0.762</w:t>
+              <w:t>0.768</w:t>
             </w:r>
           </w:p>
         </w:tc>
@@ -5016,7 +5940,7 @@
                 <w:color w:val="17212B"/>
                 <w:sz w:val="18"/>
               </w:rPr>
-              <w:t>0.138</w:t>
+              <w:t>0.127</w:t>
             </w:r>
           </w:p>
         </w:tc>
@@ -5182,7 +6106,7 @@
           <w:rFonts w:ascii="Calibri" w:hAnsi="Calibri"/>
           <w:color w:val="17212B"/>
         </w:rPr>
-        <w:t>measures held-out customers within the nine known attack families.</w:t>
+        <w:t>measures held-out customers within the 21 known attack families.</w:t>
       </w:r>
     </w:p>
     <w:p>
@@ -6737,7 +7661,7 @@
           <w:rFonts w:ascii="Calibri" w:hAnsi="Calibri"/>
           <w:color w:val="17212B"/>
         </w:rPr>
-        <w:t>Show ten attack families and select the unseen layering scenario.</w:t>
+        <w:t>Show 22 attack families, the 24-campaign threat atlas, and the unseen layering scenario.</w:t>
       </w:r>
     </w:p>
     <w:p>

</xml_diff>